<commit_message>
docs: formalizar paquete comercial general
</commit_message>
<xml_diff>
--- a/docs/production-readiness/templates/09-ACTA-SERVICIO-SELECCION-PLAN-ROUSTIX.docx
+++ b/docs/production-readiness/templates/09-ACTA-SERVICIO-SELECCION-PLAN-ROUSTIX.docx
@@ -65,7 +65,7 @@
           <w:color w:val="5B6472"/>
           <w:sz w:val="24"/>
         </w:rPr>
-        <w:t>Activación comercial, alcance contratado y responsables</w:t>
+        <w:t>Orden de activación, alcance contratado y responsables</w:t>
       </w:r>
     </w:p>
     <w:tbl>
@@ -193,7 +193,7 @@
                 <w:color w:val="1D2733"/>
                 <w:sz w:val="19"/>
               </w:rPr>
-              <w:t>1.1</w:t>
+              <w:t>2.0</w:t>
             </w:r>
           </w:p>
         </w:tc>
@@ -253,7 +253,7 @@
                 <w:color w:val="1D2733"/>
                 <w:sz w:val="19"/>
               </w:rPr>
-              <w:t>Plantilla para completar y firmar</w:t>
+              <w:t>Plantilla comercial para completar y firmar</w:t>
             </w:r>
           </w:p>
         </w:tc>
@@ -367,7 +367,7 @@
                 <w:color w:val="1D2733"/>
                 <w:sz w:val="19"/>
               </w:rPr>
-              <w:t>Dejar constancia del servicio Roustix que se activa para una empresa, el plan seleccionado, sus límites, complementos, valor, vigencia y responsables.</w:t>
+              <w:t>Dejar constancia del servicio Roustix contratado por el Cliente, el plan, las capacidades, complementos, valores, vigencia, responsables y condiciones de activación.</w:t>
             </w:r>
           </w:p>
         </w:tc>
@@ -417,7 +417,7 @@
                 <w:color w:val="1D2733"/>
                 <w:sz w:val="19"/>
               </w:rPr>
-              <w:t>Documento complementario</w:t>
+              <w:t>Documento contractual complementario</w:t>
             </w:r>
           </w:p>
           <w:p>
@@ -430,7 +430,7 @@
                 <w:color w:val="1D2733"/>
                 <w:sz w:val="19"/>
               </w:rPr>
-              <w:t>Esta acta concreta la orden de servicio. Debe leerse junto con el contrato SaaS o los términos del piloto, la Guía Operativa y los documentos de privacidad y transmisión aplicables.</w:t>
+              <w:t>Esta acta concreta la Orden de servicio y debe leerse junto con la propuesta aceptada, el Contrato SaaS, los documentos de privacidad y transmisión, la Política de Soporte y el SLA cuando se anexe expresamente.</w:t>
             </w:r>
           </w:p>
         </w:tc>
@@ -911,7 +911,7 @@
                 <w:color w:val="0A2540"/>
                 <w:sz w:val="19"/>
               </w:rPr>
-              <w:t>Modalidad</w:t>
+              <w:t>Tipo de Orden</w:t>
             </w:r>
           </w:p>
         </w:tc>
@@ -938,7 +938,7 @@
                 <w:color w:val="1D2733"/>
                 <w:sz w:val="19"/>
               </w:rPr>
-              <w:t>☐ Piloto controlado  ☐ Servicio SaaS posterior al piloto</w:t>
+              <w:t>☐ Nuevo servicio  ☐ Renovación  ☐ Ampliación  ☐ Modificación</w:t>
             </w:r>
           </w:p>
         </w:tc>
@@ -1615,7 +1615,7 @@
                 <w:color w:val="1D2733"/>
                 <w:sz w:val="19"/>
               </w:rPr>
-              <w:t>Desde $2.500.000 COP</w:t>
+              <w:t>Según cotización</w:t>
             </w:r>
           </w:p>
         </w:tc>
@@ -1696,7 +1696,7 @@
                 <w:color w:val="1D2733"/>
                 <w:sz w:val="19"/>
               </w:rPr>
-              <w:t>Todos / según alcance</w:t>
+              <w:t>Todos / alcance</w:t>
             </w:r>
           </w:p>
         </w:tc>
@@ -1766,7 +1766,7 @@
           <w:color w:val="1D2733"/>
           <w:sz w:val="22"/>
         </w:rPr>
-        <w:t>Enterprise se cotiza de acuerdo con el alcance definitivo. Los valores, impuestos, descuentos o condiciones especiales aplicables deben quedar diligenciados en la sección económica de esta acta.</w:t>
+        <w:t>Enterprise se cotiza de acuerdo con el alcance definitivo. Los valores, impuestos, descuentos y condiciones especiales deben quedar diligenciados en la sección económica de esta acta.</w:t>
       </w:r>
     </w:p>
     <w:p>
@@ -2587,7 +2587,7 @@
                 <w:color w:val="1D2733"/>
                 <w:sz w:val="19"/>
               </w:rPr>
-              <w:t>Respaldos y recuperación conforme a la Guía Operativa y condiciones vigentes.</w:t>
+              <w:t>Respaldos y recuperación conforme a los controles y condiciones vigentes.</w:t>
             </w:r>
           </w:p>
         </w:tc>
@@ -3565,7 +3565,7 @@
                 <w:color w:val="1D2733"/>
                 <w:sz w:val="19"/>
               </w:rPr>
-              <w:t>Usuario adicional</w:t>
+              <w:t>Usuarios adicionales</w:t>
             </w:r>
           </w:p>
         </w:tc>
@@ -3619,147 +3619,7 @@
                 <w:color w:val="1D2733"/>
                 <w:sz w:val="19"/>
               </w:rPr>
-              <w:t>$40.000 COP / usuario</w:t>
-            </w:r>
-          </w:p>
-        </w:tc>
-        <w:tc>
-          <w:tcPr>
-            <w:tcW w:type="dxa" w:w="1300"/>
-            <w:tcMar>
-              <w:top w:w="80" w:type="dxa"/>
-              <w:start w:w="120" w:type="dxa"/>
-              <w:bottom w:w="80" w:type="dxa"/>
-              <w:end w:w="120" w:type="dxa"/>
-            </w:tcMar>
-            <w:vAlign w:val="center"/>
-          </w:tcPr>
-          <w:p>
-            <w:pPr>
-              <w:spacing w:before="0" w:after="0" w:line="264" w:lineRule="auto"/>
-              <w:jc w:val="left"/>
-            </w:pPr>
-            <w:r>
-              <w:rPr>
-                <w:rFonts w:ascii="Calibri" w:hAnsi="Calibri"/>
-                <w:b w:val="0"/>
-                <w:color w:val="1D2733"/>
-                <w:sz w:val="19"/>
-              </w:rPr>
-              <w:t>______</w:t>
-            </w:r>
-          </w:p>
-        </w:tc>
-        <w:tc>
-          <w:tcPr>
-            <w:tcW w:type="dxa" w:w="1860"/>
-            <w:tcMar>
-              <w:top w:w="80" w:type="dxa"/>
-              <w:start w:w="120" w:type="dxa"/>
-              <w:bottom w:w="80" w:type="dxa"/>
-              <w:end w:w="120" w:type="dxa"/>
-            </w:tcMar>
-            <w:vAlign w:val="center"/>
-          </w:tcPr>
-          <w:p>
-            <w:pPr>
-              <w:spacing w:before="0" w:after="0" w:line="264" w:lineRule="auto"/>
-              <w:jc w:val="left"/>
-            </w:pPr>
-            <w:r>
-              <w:rPr>
-                <w:rFonts w:ascii="Calibri" w:hAnsi="Calibri"/>
-                <w:b w:val="0"/>
-                <w:color w:val="1D2733"/>
-                <w:sz w:val="19"/>
-              </w:rPr>
-              <w:t>☐</w:t>
-            </w:r>
-          </w:p>
-        </w:tc>
-      </w:tr>
-      <w:tr>
-        <w:trPr>
-          <w:cantSplit/>
-        </w:trPr>
-        <w:tc>
-          <w:tcPr>
-            <w:tcW w:type="dxa" w:w="2600"/>
-            <w:tcMar>
-              <w:top w:w="80" w:type="dxa"/>
-              <w:start w:w="120" w:type="dxa"/>
-              <w:bottom w:w="80" w:type="dxa"/>
-              <w:end w:w="120" w:type="dxa"/>
-            </w:tcMar>
-            <w:vAlign w:val="center"/>
-          </w:tcPr>
-          <w:p>
-            <w:pPr>
-              <w:spacing w:before="0" w:after="0" w:line="264" w:lineRule="auto"/>
-              <w:jc w:val="left"/>
-            </w:pPr>
-            <w:r>
-              <w:rPr>
-                <w:rFonts w:ascii="Calibri" w:hAnsi="Calibri"/>
-                <w:b w:val="0"/>
-                <w:color w:val="1D2733"/>
-                <w:sz w:val="19"/>
-              </w:rPr>
-              <w:t>Soporte prioritario</w:t>
-            </w:r>
-          </w:p>
-        </w:tc>
-        <w:tc>
-          <w:tcPr>
-            <w:tcW w:type="dxa" w:w="1600"/>
-            <w:tcMar>
-              <w:top w:w="80" w:type="dxa"/>
-              <w:start w:w="120" w:type="dxa"/>
-              <w:bottom w:w="80" w:type="dxa"/>
-              <w:end w:w="120" w:type="dxa"/>
-            </w:tcMar>
-            <w:vAlign w:val="center"/>
-          </w:tcPr>
-          <w:p>
-            <w:pPr>
-              <w:spacing w:before="0" w:after="0" w:line="264" w:lineRule="auto"/>
-              <w:jc w:val="left"/>
-            </w:pPr>
-            <w:r>
-              <w:rPr>
-                <w:rFonts w:ascii="Calibri" w:hAnsi="Calibri"/>
-                <w:b w:val="0"/>
-                <w:color w:val="1D2733"/>
-                <w:sz w:val="19"/>
-              </w:rPr>
-              <w:t>ADD-SUP-PRI</w:t>
-            </w:r>
-          </w:p>
-        </w:tc>
-        <w:tc>
-          <w:tcPr>
-            <w:tcW w:type="dxa" w:w="2000"/>
-            <w:tcMar>
-              <w:top w:w="80" w:type="dxa"/>
-              <w:start w:w="120" w:type="dxa"/>
-              <w:bottom w:w="80" w:type="dxa"/>
-              <w:end w:w="120" w:type="dxa"/>
-            </w:tcMar>
-            <w:vAlign w:val="center"/>
-          </w:tcPr>
-          <w:p>
-            <w:pPr>
-              <w:spacing w:before="0" w:after="0" w:line="264" w:lineRule="auto"/>
-              <w:jc w:val="left"/>
-            </w:pPr>
-            <w:r>
-              <w:rPr>
-                <w:rFonts w:ascii="Calibri" w:hAnsi="Calibri"/>
-                <w:b w:val="0"/>
-                <w:color w:val="1D2733"/>
-                <w:sz w:val="19"/>
-              </w:rPr>
-              <w:t>$350.000 COP</w:t>
+              <w:t>Según cotización</w:t>
             </w:r>
           </w:p>
         </w:tc>
@@ -3880,7 +3740,7 @@
                 <w:color w:val="1D2733"/>
                 <w:sz w:val="19"/>
               </w:rPr>
-              <w:t>Valores comerciales sugeridos</w:t>
+              <w:t>Valores de referencia</w:t>
             </w:r>
           </w:p>
           <w:p>
@@ -3893,7 +3753,7 @@
                 <w:color w:val="1D2733"/>
                 <w:sz w:val="19"/>
               </w:rPr>
-              <w:t>Los siguientes valores son referencias para estructurar la cotización. No constituyen una tarifa definitiva hasta que el servicio, alcance, impuestos, desplazamientos y entregables queden aceptados por escrito.</w:t>
+              <w:t>Los valores se confirman en la propuesta o cotización aceptada. El alcance, impuestos, desplazamientos, dependencias y entregables deben quedar por escrito antes de iniciar.</w:t>
             </w:r>
           </w:p>
         </w:tc>
@@ -4033,7 +3893,7 @@
                 <w:color w:val="FFFFFF"/>
                 <w:sz w:val="19"/>
               </w:rPr>
-              <w:t>Valor sugerido</w:t>
+              <w:t>Valor</w:t>
             </w:r>
           </w:p>
         </w:tc>
@@ -4093,7 +3953,7 @@
                 <w:color w:val="1D2733"/>
                 <w:sz w:val="19"/>
               </w:rPr>
-              <w:t>Capacitación remota adicional</w:t>
+              <w:t>Capacitación adicional</w:t>
             </w:r>
           </w:p>
         </w:tc>
@@ -4120,7 +3980,7 @@
                 <w:color w:val="1D2733"/>
                 <w:sz w:val="19"/>
               </w:rPr>
-              <w:t>ADD-TRN-REM</w:t>
+              <w:t>ADD-TRN-COT</w:t>
             </w:r>
           </w:p>
         </w:tc>
@@ -4147,7 +4007,7 @@
                 <w:color w:val="1D2733"/>
                 <w:sz w:val="19"/>
               </w:rPr>
-              <w:t>Sesión de hasta 2 horas</w:t>
+              <w:t>Sesión o jornada acordada</w:t>
             </w:r>
           </w:p>
         </w:tc>
@@ -4174,7 +4034,7 @@
                 <w:color w:val="1D2733"/>
                 <w:sz w:val="19"/>
               </w:rPr>
-              <w:t>$250.000 COP</w:t>
+              <w:t>Según cotización</w:t>
             </w:r>
           </w:p>
         </w:tc>
@@ -4233,7 +4093,7 @@
                 <w:color w:val="1D2733"/>
                 <w:sz w:val="19"/>
               </w:rPr>
-              <w:t>Capacitación o implementación en sitio</w:t>
+              <w:t>Implementación en sitio</w:t>
             </w:r>
           </w:p>
         </w:tc>
@@ -4287,7 +4147,7 @@
                 <w:color w:val="1D2733"/>
                 <w:sz w:val="19"/>
               </w:rPr>
-              <w:t>Jornada de hasta 8 horas en Bogotá</w:t>
+              <w:t>Jornada y ubicación acordadas</w:t>
             </w:r>
           </w:p>
         </w:tc>
@@ -4314,7 +4174,7 @@
                 <w:color w:val="1D2733"/>
                 <w:sz w:val="19"/>
               </w:rPr>
-              <w:t>$900.000 COP + gastos</w:t>
+              <w:t>Según cotización</w:t>
             </w:r>
           </w:p>
         </w:tc>
@@ -4400,7 +4260,7 @@
                 <w:color w:val="1D2733"/>
                 <w:sz w:val="19"/>
               </w:rPr>
-              <w:t>ADD-MIG-500</w:t>
+              <w:t>ADD-MIG-COT</w:t>
             </w:r>
           </w:p>
         </w:tc>
@@ -4427,7 +4287,7 @@
                 <w:color w:val="1D2733"/>
                 <w:sz w:val="19"/>
               </w:rPr>
-              <w:t>Hasta 500 registros en plantilla validada</w:t>
+              <w:t>Plantilla y volumen validados</w:t>
             </w:r>
           </w:p>
         </w:tc>
@@ -4454,7 +4314,7 @@
                 <w:color w:val="1D2733"/>
                 <w:sz w:val="19"/>
               </w:rPr>
-              <w:t>$600.000 COP</w:t>
+              <w:t>Según cotización</w:t>
             </w:r>
           </w:p>
         </w:tc>
@@ -4540,7 +4400,7 @@
                 <w:color w:val="1D2733"/>
                 <w:sz w:val="19"/>
               </w:rPr>
-              <w:t>ADD-DATA-CLE</w:t>
+              <w:t>ADD-DATA-COT</w:t>
             </w:r>
           </w:p>
         </w:tc>
@@ -4567,7 +4427,7 @@
                 <w:color w:val="1D2733"/>
                 <w:sz w:val="19"/>
               </w:rPr>
-              <w:t>Paquete inicial; alcance por diagnóstico</w:t>
+              <w:t>Alcance por diagnóstico</w:t>
             </w:r>
           </w:p>
         </w:tc>
@@ -4594,7 +4454,7 @@
                 <w:color w:val="1D2733"/>
                 <w:sz w:val="19"/>
               </w:rPr>
-              <w:t>Desde $600.000 COP</w:t>
+              <w:t>Según cotización</w:t>
             </w:r>
           </w:p>
         </w:tc>
@@ -4653,147 +4513,7 @@
                 <w:color w:val="1D2733"/>
                 <w:sz w:val="19"/>
               </w:rPr>
-              <w:t>Consultoría de configuración</w:t>
-            </w:r>
-          </w:p>
-        </w:tc>
-        <w:tc>
-          <w:tcPr>
-            <w:tcW w:type="dxa" w:w="1450"/>
-            <w:tcMar>
-              <w:top w:w="80" w:type="dxa"/>
-              <w:start w:w="120" w:type="dxa"/>
-              <w:bottom w:w="80" w:type="dxa"/>
-              <w:end w:w="120" w:type="dxa"/>
-            </w:tcMar>
-            <w:vAlign w:val="center"/>
-          </w:tcPr>
-          <w:p>
-            <w:pPr>
-              <w:spacing w:before="0" w:after="0" w:line="264" w:lineRule="auto"/>
-              <w:jc w:val="left"/>
-            </w:pPr>
-            <w:r>
-              <w:rPr>
-                <w:rFonts w:ascii="Calibri" w:hAnsi="Calibri"/>
-                <w:b w:val="0"/>
-                <w:color w:val="1D2733"/>
-                <w:sz w:val="19"/>
-              </w:rPr>
-              <w:t>ADD-CNS-4H</w:t>
-            </w:r>
-          </w:p>
-        </w:tc>
-        <w:tc>
-          <w:tcPr>
-            <w:tcW w:type="dxa" w:w="2800"/>
-            <w:tcMar>
-              <w:top w:w="80" w:type="dxa"/>
-              <w:start w:w="120" w:type="dxa"/>
-              <w:bottom w:w="80" w:type="dxa"/>
-              <w:end w:w="120" w:type="dxa"/>
-            </w:tcMar>
-            <w:vAlign w:val="center"/>
-          </w:tcPr>
-          <w:p>
-            <w:pPr>
-              <w:spacing w:before="0" w:after="0" w:line="264" w:lineRule="auto"/>
-              <w:jc w:val="left"/>
-            </w:pPr>
-            <w:r>
-              <w:rPr>
-                <w:rFonts w:ascii="Calibri" w:hAnsi="Calibri"/>
-                <w:b w:val="0"/>
-                <w:color w:val="1D2733"/>
-                <w:sz w:val="19"/>
-              </w:rPr>
-              <w:t>Bloque remoto de hasta 4 horas</w:t>
-            </w:r>
-          </w:p>
-        </w:tc>
-        <w:tc>
-          <w:tcPr>
-            <w:tcW w:type="dxa" w:w="1800"/>
-            <w:tcMar>
-              <w:top w:w="80" w:type="dxa"/>
-              <w:start w:w="120" w:type="dxa"/>
-              <w:bottom w:w="80" w:type="dxa"/>
-              <w:end w:w="120" w:type="dxa"/>
-            </w:tcMar>
-            <w:vAlign w:val="center"/>
-          </w:tcPr>
-          <w:p>
-            <w:pPr>
-              <w:spacing w:before="0" w:after="0" w:line="264" w:lineRule="auto"/>
-              <w:jc w:val="left"/>
-            </w:pPr>
-            <w:r>
-              <w:rPr>
-                <w:rFonts w:ascii="Calibri" w:hAnsi="Calibri"/>
-                <w:b w:val="0"/>
-                <w:color w:val="1D2733"/>
-                <w:sz w:val="19"/>
-              </w:rPr>
-              <w:t>$500.000 COP</w:t>
-            </w:r>
-          </w:p>
-        </w:tc>
-        <w:tc>
-          <w:tcPr>
-            <w:tcW w:type="dxa" w:w="1110"/>
-            <w:tcMar>
-              <w:top w:w="80" w:type="dxa"/>
-              <w:start w:w="120" w:type="dxa"/>
-              <w:bottom w:w="80" w:type="dxa"/>
-              <w:end w:w="120" w:type="dxa"/>
-            </w:tcMar>
-            <w:vAlign w:val="center"/>
-          </w:tcPr>
-          <w:p>
-            <w:pPr>
-              <w:spacing w:before="0" w:after="0" w:line="264" w:lineRule="auto"/>
-              <w:jc w:val="left"/>
-            </w:pPr>
-            <w:r>
-              <w:rPr>
-                <w:rFonts w:ascii="Calibri" w:hAnsi="Calibri"/>
-                <w:b w:val="0"/>
-                <w:color w:val="1D2733"/>
-                <w:sz w:val="19"/>
-              </w:rPr>
-              <w:t>☐</w:t>
-            </w:r>
-          </w:p>
-        </w:tc>
-      </w:tr>
-      <w:tr>
-        <w:trPr>
-          <w:cantSplit/>
-        </w:trPr>
-        <w:tc>
-          <w:tcPr>
-            <w:tcW w:type="dxa" w:w="2200"/>
-            <w:tcMar>
-              <w:top w:w="80" w:type="dxa"/>
-              <w:start w:w="120" w:type="dxa"/>
-              <w:bottom w:w="80" w:type="dxa"/>
-              <w:end w:w="120" w:type="dxa"/>
-            </w:tcMar>
-            <w:vAlign w:val="center"/>
-          </w:tcPr>
-          <w:p>
-            <w:pPr>
-              <w:spacing w:before="0" w:after="0" w:line="264" w:lineRule="auto"/>
-              <w:jc w:val="left"/>
-            </w:pPr>
-            <w:r>
-              <w:rPr>
-                <w:rFonts w:ascii="Calibri" w:hAnsi="Calibri"/>
-                <w:b w:val="0"/>
-                <w:color w:val="1D2733"/>
-                <w:sz w:val="19"/>
-              </w:rPr>
-              <w:t>Formato PDF o informe personalizado</w:t>
+              <w:t>Formato o informe personalizado</w:t>
             </w:r>
           </w:p>
         </w:tc>
@@ -4847,7 +4567,7 @@
                 <w:color w:val="1D2733"/>
                 <w:sz w:val="19"/>
               </w:rPr>
-              <w:t>Cada formato aprobado</w:t>
+              <w:t>Por formato aprobado</w:t>
             </w:r>
           </w:p>
         </w:tc>
@@ -4874,7 +4594,7 @@
                 <w:color w:val="1D2733"/>
                 <w:sz w:val="19"/>
               </w:rPr>
-              <w:t>Desde $450.000 COP</w:t>
+              <w:t>Según cotización</w:t>
             </w:r>
           </w:p>
         </w:tc>
@@ -5014,7 +4734,7 @@
                 <w:color w:val="1D2733"/>
                 <w:sz w:val="19"/>
               </w:rPr>
-              <w:t>Desde $1.500.000 COP</w:t>
+              <w:t>Según cotización</w:t>
             </w:r>
           </w:p>
         </w:tc>
@@ -5073,7 +4793,7 @@
                 <w:color w:val="1D2733"/>
                 <w:sz w:val="19"/>
               </w:rPr>
-              <w:t>Desarrollo o personalización especial</w:t>
+              <w:t>Desarrollo especial</w:t>
             </w:r>
           </w:p>
         </w:tc>
@@ -5127,7 +4847,7 @@
                 <w:color w:val="1D2733"/>
                 <w:sz w:val="19"/>
               </w:rPr>
-              <w:t>Bolsa o proyecto previamente estimado</w:t>
+              <w:t>Bolsa o proyecto estimado</w:t>
             </w:r>
           </w:p>
         </w:tc>
@@ -5154,7 +4874,7 @@
                 <w:color w:val="1D2733"/>
                 <w:sz w:val="19"/>
               </w:rPr>
-              <w:t>$180.000 COP / hora</w:t>
+              <w:t>Según cotización</w:t>
             </w:r>
           </w:p>
         </w:tc>
@@ -6324,7 +6044,7 @@
                 <w:color w:val="1D2733"/>
                 <w:sz w:val="19"/>
               </w:rPr>
-              <w:t>☐ Automática  ☐ Por acuerdo expreso  ☐ No aplica al piloto</w:t>
+              <w:t>☐ Automática  ☐ Por acuerdo expreso  ☐ Sin renovación automática</w:t>
             </w:r>
           </w:p>
         </w:tc>
@@ -7249,7 +6969,7 @@
                 <w:color w:val="0A2540"/>
                 <w:sz w:val="19"/>
               </w:rPr>
-              <w:t>Canal temporal de soporte</w:t>
+              <w:t>Canal de soporte</w:t>
             </w:r>
           </w:p>
         </w:tc>
@@ -7276,7 +6996,7 @@
                 <w:color w:val="1D2733"/>
                 <w:sz w:val="19"/>
               </w:rPr>
-              <w:t>soporte.roustix@hotmail.com</w:t>
+              <w:t>contacto@roustix.com</w:t>
             </w:r>
           </w:p>
         </w:tc>
@@ -7369,7 +7089,7 @@
                 <w:color w:val="0A2540"/>
                 <w:sz w:val="19"/>
               </w:rPr>
-              <w:t>Canal alterno</w:t>
+              <w:t>Canal alterno pactado</w:t>
             </w:r>
           </w:p>
         </w:tc>
@@ -7797,7 +7517,7 @@
                 <w:color w:val="1D2733"/>
                 <w:sz w:val="19"/>
               </w:rPr>
-              <w:t>Términos o contrato aceptados</w:t>
+              <w:t>Propuesta, contrato y acta aceptados</w:t>
             </w:r>
           </w:p>
         </w:tc>
@@ -7967,7 +7687,7 @@
                 <w:color w:val="1D2733"/>
                 <w:sz w:val="19"/>
               </w:rPr>
-              <w:t>Guía Operativa entregada</w:t>
+              <w:t>Política de soporte entregada</w:t>
             </w:r>
           </w:p>
         </w:tc>
@@ -8363,6 +8083,7 @@
                 <w:color w:val="1D2733"/>
                 <w:sz w:val="19"/>
               </w:rPr>
+              <w:t>COM-PRO-001</w:t>
             </w:r>
           </w:p>
         </w:tc>
@@ -8420,7 +8141,7 @@
                 <w:color w:val="1D2733"/>
                 <w:sz w:val="19"/>
               </w:rPr>
-              <w:t>Contrato SaaS o Términos del Piloto</w:t>
+              <w:t>Contrato SaaS</w:t>
             </w:r>
           </w:p>
         </w:tc>
@@ -8447,6 +8168,7 @@
                 <w:color w:val="1D2733"/>
                 <w:sz w:val="19"/>
               </w:rPr>
+              <w:t>RTX-LEGAL-002</w:t>
             </w:r>
           </w:p>
         </w:tc>
@@ -8504,7 +8226,7 @@
                 <w:color w:val="1D2733"/>
                 <w:sz w:val="19"/>
               </w:rPr>
-              <w:t>Política, aviso y autorización</w:t>
+              <w:t>Acta de Servicio y Selección de Plan</w:t>
             </w:r>
           </w:p>
         </w:tc>
@@ -8531,6 +8253,92 @@
                 <w:color w:val="1D2733"/>
                 <w:sz w:val="19"/>
               </w:rPr>
+              <w:t>SAA-ACT-001</w:t>
+            </w:r>
+          </w:p>
+        </w:tc>
+        <w:tc>
+          <w:tcPr>
+            <w:tcW w:type="dxa" w:w="2760"/>
+            <w:tcMar>
+              <w:top w:w="80" w:type="dxa"/>
+              <w:start w:w="120" w:type="dxa"/>
+              <w:bottom w:w="80" w:type="dxa"/>
+              <w:end w:w="120" w:type="dxa"/>
+            </w:tcMar>
+            <w:vAlign w:val="center"/>
+          </w:tcPr>
+          <w:p>
+            <w:pPr>
+              <w:spacing w:before="0" w:after="0" w:line="264" w:lineRule="auto"/>
+              <w:jc w:val="left"/>
+            </w:pPr>
+            <w:r>
+              <w:rPr>
+                <w:rFonts w:ascii="Calibri" w:hAnsi="Calibri"/>
+                <w:b w:val="0"/>
+                <w:color w:val="1D2733"/>
+                <w:sz w:val="19"/>
+              </w:rPr>
+            </w:r>
+          </w:p>
+        </w:tc>
+      </w:tr>
+      <w:tr>
+        <w:trPr>
+          <w:cantSplit/>
+        </w:trPr>
+        <w:tc>
+          <w:tcPr>
+            <w:tcW w:type="dxa" w:w="4200"/>
+            <w:tcMar>
+              <w:top w:w="80" w:type="dxa"/>
+              <w:start w:w="120" w:type="dxa"/>
+              <w:bottom w:w="80" w:type="dxa"/>
+              <w:end w:w="120" w:type="dxa"/>
+            </w:tcMar>
+            <w:vAlign w:val="center"/>
+          </w:tcPr>
+          <w:p>
+            <w:pPr>
+              <w:spacing w:before="0" w:after="0" w:line="264" w:lineRule="auto"/>
+              <w:jc w:val="left"/>
+            </w:pPr>
+            <w:r>
+              <w:rPr>
+                <w:rFonts w:ascii="Calibri" w:hAnsi="Calibri"/>
+                <w:b w:val="0"/>
+                <w:color w:val="1D2733"/>
+                <w:sz w:val="19"/>
+              </w:rPr>
+              <w:t>Política de privacidad y anexos</w:t>
+            </w:r>
+          </w:p>
+        </w:tc>
+        <w:tc>
+          <w:tcPr>
+            <w:tcW w:type="dxa" w:w="2400"/>
+            <w:tcMar>
+              <w:top w:w="80" w:type="dxa"/>
+              <w:start w:w="120" w:type="dxa"/>
+              <w:bottom w:w="80" w:type="dxa"/>
+              <w:end w:w="120" w:type="dxa"/>
+            </w:tcMar>
+            <w:vAlign w:val="center"/>
+          </w:tcPr>
+          <w:p>
+            <w:pPr>
+              <w:spacing w:before="0" w:after="0" w:line="264" w:lineRule="auto"/>
+              <w:jc w:val="left"/>
+            </w:pPr>
+            <w:r>
+              <w:rPr>
+                <w:rFonts w:ascii="Calibri" w:hAnsi="Calibri"/>
+                <w:b w:val="0"/>
+                <w:color w:val="1D2733"/>
+                <w:sz w:val="19"/>
+              </w:rPr>
+              <w:t>RTX-PRIV-001</w:t>
             </w:r>
           </w:p>
         </w:tc>
@@ -8615,6 +8423,7 @@
                 <w:color w:val="1D2733"/>
                 <w:sz w:val="19"/>
               </w:rPr>
+              <w:t>PIL-LEG-003 / versión vigente</w:t>
             </w:r>
           </w:p>
         </w:tc>
@@ -8672,7 +8481,7 @@
                 <w:color w:val="1D2733"/>
                 <w:sz w:val="19"/>
               </w:rPr>
-              <w:t>Guía Operativa</w:t>
+              <w:t>Política de soporte</w:t>
             </w:r>
           </w:p>
         </w:tc>
@@ -8699,6 +8508,92 @@
                 <w:color w:val="1D2733"/>
                 <w:sz w:val="19"/>
               </w:rPr>
+              <w:t>RTX-SUP-001</w:t>
+            </w:r>
+          </w:p>
+        </w:tc>
+        <w:tc>
+          <w:tcPr>
+            <w:tcW w:type="dxa" w:w="2760"/>
+            <w:tcMar>
+              <w:top w:w="80" w:type="dxa"/>
+              <w:start w:w="120" w:type="dxa"/>
+              <w:bottom w:w="80" w:type="dxa"/>
+              <w:end w:w="120" w:type="dxa"/>
+            </w:tcMar>
+            <w:vAlign w:val="center"/>
+          </w:tcPr>
+          <w:p>
+            <w:pPr>
+              <w:spacing w:before="0" w:after="0" w:line="264" w:lineRule="auto"/>
+              <w:jc w:val="left"/>
+            </w:pPr>
+            <w:r>
+              <w:rPr>
+                <w:rFonts w:ascii="Calibri" w:hAnsi="Calibri"/>
+                <w:b w:val="0"/>
+                <w:color w:val="1D2733"/>
+                <w:sz w:val="19"/>
+              </w:rPr>
+            </w:r>
+          </w:p>
+        </w:tc>
+      </w:tr>
+      <w:tr>
+        <w:trPr>
+          <w:cantSplit/>
+        </w:trPr>
+        <w:tc>
+          <w:tcPr>
+            <w:tcW w:type="dxa" w:w="4200"/>
+            <w:tcMar>
+              <w:top w:w="80" w:type="dxa"/>
+              <w:start w:w="120" w:type="dxa"/>
+              <w:bottom w:w="80" w:type="dxa"/>
+              <w:end w:w="120" w:type="dxa"/>
+            </w:tcMar>
+            <w:vAlign w:val="center"/>
+          </w:tcPr>
+          <w:p>
+            <w:pPr>
+              <w:spacing w:before="0" w:after="0" w:line="264" w:lineRule="auto"/>
+              <w:jc w:val="left"/>
+            </w:pPr>
+            <w:r>
+              <w:rPr>
+                <w:rFonts w:ascii="Calibri" w:hAnsi="Calibri"/>
+                <w:b w:val="0"/>
+                <w:color w:val="1D2733"/>
+                <w:sz w:val="19"/>
+              </w:rPr>
+              <w:t>SLA, si se anexa</w:t>
+            </w:r>
+          </w:p>
+        </w:tc>
+        <w:tc>
+          <w:tcPr>
+            <w:tcW w:type="dxa" w:w="2400"/>
+            <w:tcMar>
+              <w:top w:w="80" w:type="dxa"/>
+              <w:start w:w="120" w:type="dxa"/>
+              <w:bottom w:w="80" w:type="dxa"/>
+              <w:end w:w="120" w:type="dxa"/>
+            </w:tcMar>
+            <w:vAlign w:val="center"/>
+          </w:tcPr>
+          <w:p>
+            <w:pPr>
+              <w:spacing w:before="0" w:after="0" w:line="264" w:lineRule="auto"/>
+              <w:jc w:val="left"/>
+            </w:pPr>
+            <w:r>
+              <w:rPr>
+                <w:rFonts w:ascii="Calibri" w:hAnsi="Calibri"/>
+                <w:b w:val="0"/>
+                <w:color w:val="1D2733"/>
+                <w:sz w:val="19"/>
+              </w:rPr>
+              <w:t>RTX-SLA-001</w:t>
             </w:r>
           </w:p>
         </w:tc>
@@ -8905,7 +8800,7 @@
                 <w:color w:val="1D2733"/>
                 <w:sz w:val="19"/>
               </w:rPr>
-              <w:t>Prestador / operadores de Roustix</w:t>
+              <w:t>Prestador Roustix</w:t>
             </w:r>
           </w:p>
         </w:tc>
@@ -9202,7 +9097,7 @@
               <w:color w:val="5B6472"/>
               <w:sz w:val="16"/>
             </w:rPr>
-            <w:t>SAA-ACT-001 · Versión 1.1</w:t>
+            <w:t>SAA-ACT-001 · Versión 2.0</w:t>
           </w:r>
         </w:p>
       </w:tc>

</xml_diff>